<commit_message>
Update SWD392 reports and move assignment brief into README
</commit_message>
<xml_diff>
--- a/SWD392_Reports/Assignment01-UC-Model.docx
+++ b/SWD392_Reports/Assignment01-UC-Model.docx
@@ -98,6 +98,7 @@
         <w:spacing w:after="60"/>
         <w:jc w:val="center"/>
       </w:pPr>
+      <w:bookmarkStart w:id="0" w:name="_Hlk235110961"/>
       <w:r>
         <w:rPr>
           <w:sz w:val="26"/>
@@ -173,6 +174,7 @@
         <w:t>ANNV22</w:t>
       </w:r>
     </w:p>
+    <w:bookmarkEnd w:id="0"/>
     <w:p/>
     <w:p/>
     <w:p/>
@@ -1524,7 +1526,7 @@
       <w:pPr>
         <w:pStyle w:val="Heading1"/>
       </w:pPr>
-      <w:bookmarkStart w:id="0" w:name="_Toc232962668"/>
+      <w:bookmarkStart w:id="1" w:name="_Toc232962668"/>
       <w:r>
         <w:rPr>
           <w:b w:val="0"/>
@@ -1533,7 +1535,7 @@
         <w:lastRenderedPageBreak/>
         <w:t>I. Record of Changes</w:t>
       </w:r>
-      <w:bookmarkEnd w:id="0"/>
+      <w:bookmarkEnd w:id="1"/>
     </w:p>
     <w:tbl>
       <w:tblPr>
@@ -1770,7 +1772,7 @@
               <w:spacing w:after="20"/>
             </w:pPr>
             <w:r>
-              <w:t>&lt;Student Name&gt;</w:t>
+              <w:t>Tungtbshe163855</w:t>
             </w:r>
           </w:p>
         </w:tc>
@@ -2006,7 +2008,7 @@
       <w:pPr>
         <w:pStyle w:val="Heading1"/>
       </w:pPr>
-      <w:bookmarkStart w:id="1" w:name="_Toc232962669"/>
+      <w:bookmarkStart w:id="2" w:name="_Toc232962669"/>
       <w:r>
         <w:rPr>
           <w:b w:val="0"/>
@@ -2014,13 +2016,13 @@
         </w:rPr>
         <w:t>II. Software Requirement Specification</w:t>
       </w:r>
-      <w:bookmarkEnd w:id="1"/>
+      <w:bookmarkEnd w:id="2"/>
     </w:p>
     <w:p>
       <w:pPr>
         <w:pStyle w:val="Heading2"/>
       </w:pPr>
-      <w:bookmarkStart w:id="2" w:name="_Toc232962670"/>
+      <w:bookmarkStart w:id="3" w:name="_Toc232962670"/>
       <w:r>
         <w:rPr>
           <w:b w:val="0"/>
@@ -2028,7 +2030,7 @@
         </w:rPr>
         <w:t>1. Context Diagram</w:t>
       </w:r>
-      <w:bookmarkEnd w:id="2"/>
+      <w:bookmarkEnd w:id="3"/>
     </w:p>
     <w:p>
       <w:pPr>
@@ -2114,7 +2116,7 @@
       <w:pPr>
         <w:pStyle w:val="Heading2"/>
       </w:pPr>
-      <w:bookmarkStart w:id="3" w:name="_Toc232962671"/>
+      <w:bookmarkStart w:id="4" w:name="_Toc232962671"/>
       <w:r>
         <w:rPr>
           <w:b w:val="0"/>
@@ -2122,13 +2124,13 @@
         </w:rPr>
         <w:t>2. Use Case Modelling</w:t>
       </w:r>
-      <w:bookmarkEnd w:id="3"/>
+      <w:bookmarkEnd w:id="4"/>
     </w:p>
     <w:p>
       <w:pPr>
         <w:pStyle w:val="Heading3"/>
       </w:pPr>
-      <w:bookmarkStart w:id="4" w:name="_Toc232962672"/>
+      <w:bookmarkStart w:id="5" w:name="_Toc232962672"/>
       <w:r>
         <w:rPr>
           <w:b w:val="0"/>
@@ -2136,7 +2138,7 @@
         </w:rPr>
         <w:t>2.1 Actors</w:t>
       </w:r>
-      <w:bookmarkEnd w:id="4"/>
+      <w:bookmarkEnd w:id="5"/>
     </w:p>
     <w:p>
       <w:pPr>
@@ -2357,7 +2359,7 @@
       <w:pPr>
         <w:pStyle w:val="Heading3"/>
       </w:pPr>
-      <w:bookmarkStart w:id="5" w:name="_Toc232962673"/>
+      <w:bookmarkStart w:id="6" w:name="_Toc232962673"/>
       <w:r>
         <w:rPr>
           <w:b w:val="0"/>
@@ -2365,13 +2367,13 @@
         </w:rPr>
         <w:t>2.2 UC Diagrams</w:t>
       </w:r>
-      <w:bookmarkEnd w:id="5"/>
+      <w:bookmarkEnd w:id="6"/>
     </w:p>
     <w:p>
       <w:pPr>
         <w:pStyle w:val="Heading4"/>
       </w:pPr>
-      <w:bookmarkStart w:id="6" w:name="_Toc232962674"/>
+      <w:bookmarkStart w:id="7" w:name="_Toc232962674"/>
       <w:r>
         <w:rPr>
           <w:b w:val="0"/>
@@ -2381,7 +2383,7 @@
         </w:rPr>
         <w:t>2.2.1 UCs for User</w:t>
       </w:r>
-      <w:bookmarkEnd w:id="6"/>
+      <w:bookmarkEnd w:id="7"/>
     </w:p>
     <w:p>
       <w:pPr>
@@ -2463,7 +2465,7 @@
       <w:pPr>
         <w:pStyle w:val="Heading3"/>
       </w:pPr>
-      <w:bookmarkStart w:id="7" w:name="_Toc232962675"/>
+      <w:bookmarkStart w:id="8" w:name="_Toc232962675"/>
       <w:r>
         <w:rPr>
           <w:b w:val="0"/>
@@ -2471,13 +2473,13 @@
         </w:rPr>
         <w:t>2.3 Activity Diagrams</w:t>
       </w:r>
-      <w:bookmarkEnd w:id="7"/>
+      <w:bookmarkEnd w:id="8"/>
     </w:p>
     <w:p>
       <w:pPr>
         <w:pStyle w:val="Heading4"/>
       </w:pPr>
-      <w:bookmarkStart w:id="8" w:name="_Toc232962676"/>
+      <w:bookmarkStart w:id="9" w:name="_Toc232962676"/>
       <w:r>
         <w:rPr>
           <w:b w:val="0"/>
@@ -2487,7 +2489,7 @@
         </w:rPr>
         <w:t>2.3.1 Login</w:t>
       </w:r>
-      <w:bookmarkEnd w:id="8"/>
+      <w:bookmarkEnd w:id="9"/>
     </w:p>
     <w:p>
       <w:pPr>
@@ -2646,7 +2648,7 @@
       <w:pPr>
         <w:pStyle w:val="Heading4"/>
       </w:pPr>
-      <w:bookmarkStart w:id="9" w:name="_Toc232962677"/>
+      <w:bookmarkStart w:id="10" w:name="_Toc232962677"/>
       <w:r>
         <w:rPr>
           <w:b w:val="0"/>
@@ -2656,7 +2658,7 @@
         </w:rPr>
         <w:t>2.3.2 Select Language</w:t>
       </w:r>
-      <w:bookmarkEnd w:id="9"/>
+      <w:bookmarkEnd w:id="10"/>
     </w:p>
     <w:p>
       <w:pPr>
@@ -2795,7 +2797,7 @@
       <w:pPr>
         <w:pStyle w:val="Heading2"/>
       </w:pPr>
-      <w:bookmarkStart w:id="10" w:name="_Toc232962678"/>
+      <w:bookmarkStart w:id="11" w:name="_Toc232962678"/>
       <w:r>
         <w:rPr>
           <w:b w:val="0"/>
@@ -2803,13 +2805,13 @@
         </w:rPr>
         <w:t>3. Use Case Specifications</w:t>
       </w:r>
-      <w:bookmarkEnd w:id="10"/>
+      <w:bookmarkEnd w:id="11"/>
     </w:p>
     <w:p>
       <w:pPr>
         <w:pStyle w:val="Heading3"/>
       </w:pPr>
-      <w:bookmarkStart w:id="11" w:name="_Toc232962679"/>
+      <w:bookmarkStart w:id="12" w:name="_Toc232962679"/>
       <w:r>
         <w:rPr>
           <w:b w:val="0"/>
@@ -2817,13 +2819,13 @@
         </w:rPr>
         <w:t>3.1 User Authentication</w:t>
       </w:r>
-      <w:bookmarkEnd w:id="11"/>
+      <w:bookmarkEnd w:id="12"/>
     </w:p>
     <w:p>
       <w:pPr>
         <w:pStyle w:val="Heading4"/>
       </w:pPr>
-      <w:bookmarkStart w:id="12" w:name="_Toc232962680"/>
+      <w:bookmarkStart w:id="13" w:name="_Toc232962680"/>
       <w:r>
         <w:rPr>
           <w:b w:val="0"/>
@@ -2833,7 +2835,7 @@
         </w:rPr>
         <w:t>3.1.1 Login</w:t>
       </w:r>
-      <w:bookmarkEnd w:id="12"/>
+      <w:bookmarkEnd w:id="13"/>
     </w:p>
     <w:tbl>
       <w:tblPr>
@@ -3452,7 +3454,7 @@
       <w:pPr>
         <w:pStyle w:val="Heading4"/>
       </w:pPr>
-      <w:bookmarkStart w:id="13" w:name="_Toc232962681"/>
+      <w:bookmarkStart w:id="14" w:name="_Toc232962681"/>
       <w:r>
         <w:rPr>
           <w:b w:val="0"/>
@@ -3462,7 +3464,7 @@
         </w:rPr>
         <w:t>3.1.2 Select Language</w:t>
       </w:r>
-      <w:bookmarkEnd w:id="13"/>
+      <w:bookmarkEnd w:id="14"/>
     </w:p>
     <w:tbl>
       <w:tblPr>
@@ -4002,7 +4004,7 @@
       <w:pPr>
         <w:pStyle w:val="Heading2"/>
       </w:pPr>
-      <w:bookmarkStart w:id="14" w:name="_Toc232962682"/>
+      <w:bookmarkStart w:id="15" w:name="_Toc232962682"/>
       <w:r>
         <w:rPr>
           <w:b w:val="0"/>
@@ -4010,13 +4012,13 @@
         </w:rPr>
         <w:t>4. Non-Functional Requirements</w:t>
       </w:r>
-      <w:bookmarkEnd w:id="14"/>
+      <w:bookmarkEnd w:id="15"/>
     </w:p>
     <w:p>
       <w:pPr>
         <w:pStyle w:val="Heading3"/>
       </w:pPr>
-      <w:bookmarkStart w:id="15" w:name="_Toc232962683"/>
+      <w:bookmarkStart w:id="16" w:name="_Toc232962683"/>
       <w:r>
         <w:rPr>
           <w:b w:val="0"/>
@@ -4024,7 +4026,7 @@
         </w:rPr>
         <w:t>4.1 External Interfaces</w:t>
       </w:r>
-      <w:bookmarkEnd w:id="15"/>
+      <w:bookmarkEnd w:id="16"/>
     </w:p>
     <w:p>
       <w:pPr>
@@ -4110,7 +4112,7 @@
       <w:pPr>
         <w:pStyle w:val="Heading3"/>
       </w:pPr>
-      <w:bookmarkStart w:id="16" w:name="_Toc232962684"/>
+      <w:bookmarkStart w:id="17" w:name="_Toc232962684"/>
       <w:r>
         <w:rPr>
           <w:b w:val="0"/>
@@ -4118,13 +4120,13 @@
         </w:rPr>
         <w:t>4.2 Quality Attributes</w:t>
       </w:r>
-      <w:bookmarkEnd w:id="16"/>
+      <w:bookmarkEnd w:id="17"/>
     </w:p>
     <w:p>
       <w:pPr>
         <w:pStyle w:val="Heading4"/>
       </w:pPr>
-      <w:bookmarkStart w:id="17" w:name="_Toc232962685"/>
+      <w:bookmarkStart w:id="18" w:name="_Toc232962685"/>
       <w:r>
         <w:rPr>
           <w:b w:val="0"/>
@@ -4134,7 +4136,7 @@
         </w:rPr>
         <w:t>4.2.1 Usability</w:t>
       </w:r>
-      <w:bookmarkEnd w:id="17"/>
+      <w:bookmarkEnd w:id="18"/>
     </w:p>
     <w:p>
       <w:pPr>
@@ -4179,7 +4181,7 @@
       <w:pPr>
         <w:pStyle w:val="Heading4"/>
       </w:pPr>
-      <w:bookmarkStart w:id="18" w:name="_Toc232962686"/>
+      <w:bookmarkStart w:id="19" w:name="_Toc232962686"/>
       <w:r>
         <w:rPr>
           <w:b w:val="0"/>
@@ -4189,7 +4191,7 @@
         </w:rPr>
         <w:t>4.2.2 Performance</w:t>
       </w:r>
-      <w:bookmarkEnd w:id="18"/>
+      <w:bookmarkEnd w:id="19"/>
     </w:p>
     <w:p>
       <w:pPr>
@@ -4221,7 +4223,7 @@
       <w:pPr>
         <w:pStyle w:val="Heading4"/>
       </w:pPr>
-      <w:bookmarkStart w:id="19" w:name="_Toc232962687"/>
+      <w:bookmarkStart w:id="20" w:name="_Toc232962687"/>
       <w:r>
         <w:rPr>
           <w:b w:val="0"/>
@@ -4231,7 +4233,7 @@
         </w:rPr>
         <w:t>4.2.3 Security</w:t>
       </w:r>
-      <w:bookmarkEnd w:id="19"/>
+      <w:bookmarkEnd w:id="20"/>
     </w:p>
     <w:p>
       <w:pPr>
@@ -4289,7 +4291,7 @@
       <w:pPr>
         <w:pStyle w:val="Heading4"/>
       </w:pPr>
-      <w:bookmarkStart w:id="20" w:name="_Toc232962688"/>
+      <w:bookmarkStart w:id="21" w:name="_Toc232962688"/>
       <w:r>
         <w:rPr>
           <w:b w:val="0"/>
@@ -4299,7 +4301,7 @@
         </w:rPr>
         <w:t>4.2.4 Reliability</w:t>
       </w:r>
-      <w:bookmarkEnd w:id="20"/>
+      <w:bookmarkEnd w:id="21"/>
     </w:p>
     <w:p>
       <w:pPr>

</xml_diff>